<commit_message>
Replace RAG project with CS Concept Cartographer, remove Assembly Racing Game
- Replace RAG Document Q&A with CS Concept Cartographer (Python, Streamlit, Google Gemini, vis.js, SQLite)
- Add liveUrl support to content schema and ProjectCard component
- Remove Assembly Racing Game project
- Update tech stack: LangChain/RAG -> Google Gemini, x86 Assembly -> Streamlit
- Update hero stats (6+ -> 5+ projects)
- Sync downloadable resume in public/ with updated version
</commit_message>
<xml_diff>
--- a/Rayan_Javed_Resume.docx
+++ b/Rayan_Javed_Resume.docx
@@ -41,7 +41,7 @@
         </w:rPr>
         <w:t xml:space="preserve">+92 310 4235599  |  </w:t>
       </w:r>
-      <w:hyperlink w:history="1" r:id="rIdjtkvsat6qhdcq0hyg0adh">
+      <w:hyperlink w:history="1" r:id="rIde1_tu6ewrg990i9v8wdjz">
         <w:r>
           <w:rPr>
             <w:rFonts w:ascii="Calibri" w:cs="Calibri" w:eastAsia="Calibri" w:hAnsi="Calibri"/>
@@ -62,7 +62,7 @@
         </w:rPr>
         <w:t xml:space="preserve">  |  </w:t>
       </w:r>
-      <w:hyperlink w:history="1" r:id="rIdtxx_eokrnozh_bppr8-3o">
+      <w:hyperlink w:history="1" r:id="rIdkjz1qnpsdena9rvdnijtz">
         <w:r>
           <w:rPr>
             <w:rFonts w:ascii="Calibri" w:cs="Calibri" w:eastAsia="Calibri" w:hAnsi="Calibri"/>
@@ -83,7 +83,7 @@
         </w:rPr>
         <w:t xml:space="preserve">  |  </w:t>
       </w:r>
-      <w:hyperlink w:history="1" r:id="rIdve79xeaawbenquxpfqjjy">
+      <w:hyperlink w:history="1" r:id="rIdx7jioxrru1adxgf5uekb0">
         <w:r>
           <w:rPr>
             <w:rFonts w:ascii="Calibri" w:cs="Calibri" w:eastAsia="Calibri" w:hAnsi="Calibri"/>
@@ -95,6 +95,27 @@
           <w:t xml:space="preserve">github.com/Rayan-Javed-Siddiqi</w:t>
         </w:r>
       </w:hyperlink>
+      <w:r>
+        <w:rPr>
+          <w:rFonts w:ascii="Calibri" w:cs="Calibri" w:eastAsia="Calibri" w:hAnsi="Calibri"/>
+          <w:color w:val="555555"/>
+          <w:sz w:val="18"/>
+          <w:szCs w:val="18"/>
+        </w:rPr>
+        <w:t xml:space="preserve">  |  </w:t>
+      </w:r>
+      <w:hyperlink w:history="1" r:id="rIdfy0cgy1nvwmirbueibzsd">
+        <w:r>
+          <w:rPr>
+            <w:rFonts w:ascii="Calibri" w:cs="Calibri" w:eastAsia="Calibri" w:hAnsi="Calibri"/>
+            <w:color w:val="0D7377"/>
+            <w:sz w:val="18"/>
+            <w:szCs w:val="18"/>
+            <w:u w:val="single"/>
+          </w:rPr>
+          <w:t xml:space="preserve">rayan-javed-portfolio.vercel.app</w:t>
+        </w:r>
+      </w:hyperlink>
     </w:p>
     <w:p>
       <w:pPr>
@@ -128,7 +149,7 @@
           <w:sz w:val="20"/>
           <w:szCs w:val="20"/>
         </w:rPr>
-        <w:t xml:space="preserve">Computer Science sophomore at FAST-NUCES (4th semester) seeking a summer CS internship. Passionate about software development, web technologies, and AI applications. Experienced with full-stack projects, game development, and machine learning pipelines — eager to contribute and grow within a technical team.</w:t>
+        <w:t xml:space="preserve">Computer Science sophomore at FAST-NUCES (4th semester) seeking a summer CS internship. Passionate about building across the stack — from AI-powered tools and REST APIs to C++ desktop apps and game development. Portfolio live at rayan-javed-portfolio.vercel.app.</w:t>
       </w:r>
     </w:p>
     <w:p>
@@ -363,16 +384,16 @@
           <w:sz w:val="21"/>
           <w:szCs w:val="21"/>
         </w:rPr>
-        <w:t xml:space="preserve">RAG Website</w:t>
-      </w:r>
-      <w:r>
-        <w:rPr>
-          <w:rFonts w:ascii="Calibri" w:cs="Calibri" w:eastAsia="Calibri" w:hAnsi="Calibri"/>
-          <w:color w:val="555555"/>
-          <w:sz w:val="20"/>
-          <w:szCs w:val="20"/>
-        </w:rPr>
-        <w:t xml:space="preserve">  —  Python, LangChain, Vector DB, LLM APIs</w:t>
+        <w:t xml:space="preserve">CS Concept Cartographer</w:t>
+      </w:r>
+      <w:r>
+        <w:rPr>
+          <w:rFonts w:ascii="Calibri" w:cs="Calibri" w:eastAsia="Calibri" w:hAnsi="Calibri"/>
+          <w:color w:val="555555"/>
+          <w:sz w:val="20"/>
+          <w:szCs w:val="20"/>
+        </w:rPr>
+        <w:t xml:space="preserve">  —  Python, Streamlit, Claude API, NLP</w:t>
       </w:r>
       <w:r>
         <w:rPr>
@@ -402,143 +423,68 @@
           <w:sz w:val="20"/>
           <w:szCs w:val="20"/>
         </w:rPr>
-        <w:t xml:space="preserve">Built a Retrieval-Augmented Generation web application that allows users to query documents using natural language</w:t>
-      </w:r>
-    </w:p>
-    <w:p>
-      <w:pPr>
-        <w:pStyle w:val="ListParagraph"/>
-        <w:numPr>
-          <w:ilvl w:val="0"/>
-          <w:numId w:val="2"/>
-        </w:numPr>
-        <w:spacing w:after="20" w:before="20" w:line="276" w:lineRule="auto"/>
-      </w:pPr>
-      <w:r>
-        <w:rPr>
-          <w:rFonts w:ascii="Calibri" w:cs="Calibri" w:eastAsia="Calibri" w:hAnsi="Calibri"/>
-          <w:color w:val="111111"/>
-          <w:sz w:val="20"/>
-          <w:szCs w:val="20"/>
-        </w:rPr>
-        <w:t xml:space="preserve">Implemented document ingestion pipeline with chunking, embedding, and semantic search over a vector database</w:t>
-      </w:r>
-    </w:p>
-    <w:p>
-      <w:pPr>
-        <w:pStyle w:val="ListParagraph"/>
-        <w:numPr>
-          <w:ilvl w:val="0"/>
-          <w:numId w:val="2"/>
-        </w:numPr>
-        <w:spacing w:after="20" w:before="20" w:line="276" w:lineRule="auto"/>
-      </w:pPr>
-      <w:r>
-        <w:rPr>
-          <w:rFonts w:ascii="Calibri" w:cs="Calibri" w:eastAsia="Calibri" w:hAnsi="Calibri"/>
-          <w:color w:val="111111"/>
-          <w:sz w:val="20"/>
-          <w:szCs w:val="20"/>
-        </w:rPr>
-        <w:t xml:space="preserve">Integrated LLM API for context-aware answer generation grounded in retrieved document chunks</w:t>
-      </w:r>
-    </w:p>
-    <w:p>
-      <w:pPr>
-        <w:tabs>
-          <w:tab w:val="right" w:pos="9000"/>
-        </w:tabs>
-        <w:spacing w:after="20" w:before="120" w:line="276" w:lineRule="auto"/>
-      </w:pPr>
-      <w:r>
-        <w:rPr>
-          <w:rFonts w:ascii="Calibri" w:cs="Calibri" w:eastAsia="Calibri" w:hAnsi="Calibri"/>
-          <w:b/>
-          <w:bCs/>
-          <w:color w:val="1B2A4A"/>
-          <w:sz w:val="21"/>
-          <w:szCs w:val="21"/>
-        </w:rPr>
-        <w:t xml:space="preserve">Django Inventory App + REST API</w:t>
-      </w:r>
-      <w:r>
-        <w:rPr>
-          <w:rFonts w:ascii="Calibri" w:cs="Calibri" w:eastAsia="Calibri" w:hAnsi="Calibri"/>
-          <w:color w:val="555555"/>
-          <w:sz w:val="20"/>
-          <w:szCs w:val="20"/>
-        </w:rPr>
-        <w:t xml:space="preserve">  —  Python, Django, Django REST Framework, SQLite</w:t>
-      </w:r>
-      <w:r>
-        <w:rPr>
-          <w:rFonts w:ascii="Calibri" w:cs="Calibri" w:eastAsia="Calibri" w:hAnsi="Calibri"/>
-          <w:i/>
-          <w:iCs/>
-          <w:color w:val="555555"/>
-          <w:sz w:val="19"/>
-          <w:szCs w:val="19"/>
-        </w:rPr>
-        <w:t xml:space="preserve">	2025</w:t>
-      </w:r>
-    </w:p>
-    <w:p>
-      <w:pPr>
-        <w:pStyle w:val="ListParagraph"/>
-        <w:numPr>
-          <w:ilvl w:val="0"/>
-          <w:numId w:val="2"/>
-        </w:numPr>
-        <w:spacing w:after="20" w:before="20" w:line="276" w:lineRule="auto"/>
-      </w:pPr>
-      <w:r>
-        <w:rPr>
-          <w:rFonts w:ascii="Calibri" w:cs="Calibri" w:eastAsia="Calibri" w:hAnsi="Calibri"/>
-          <w:color w:val="111111"/>
-          <w:sz w:val="20"/>
-          <w:szCs w:val="20"/>
-        </w:rPr>
-        <w:t xml:space="preserve">Built a full-stack inventory management web app with session-based auth, protected routes, and full CRUD via Django templates</w:t>
-      </w:r>
-    </w:p>
-    <w:p>
-      <w:pPr>
-        <w:pStyle w:val="ListParagraph"/>
-        <w:numPr>
-          <w:ilvl w:val="0"/>
-          <w:numId w:val="2"/>
-        </w:numPr>
-        <w:spacing w:after="20" w:before="20" w:line="276" w:lineRule="auto"/>
-      </w:pPr>
-      <w:r>
-        <w:rPr>
-          <w:rFonts w:ascii="Calibri" w:cs="Calibri" w:eastAsia="Calibri" w:hAnsi="Calibri"/>
-          <w:color w:val="111111"/>
-          <w:sz w:val="20"/>
-          <w:szCs w:val="20"/>
-        </w:rPr>
-        <w:t xml:space="preserve">Extended with a DRF REST API layer — ModelViewSet, ProductSerializer, and Token Authentication; all endpoints tested via curl</w:t>
-      </w:r>
-    </w:p>
-    <w:p>
-      <w:pPr>
-        <w:pStyle w:val="ListParagraph"/>
-        <w:numPr>
-          <w:ilvl w:val="0"/>
-          <w:numId w:val="2"/>
-        </w:numPr>
-        <w:spacing w:after="20" w:before="20" w:line="276" w:lineRule="auto"/>
-      </w:pPr>
-      <w:r>
-        <w:rPr>
-          <w:rFonts w:ascii="Calibri" w:cs="Calibri" w:eastAsia="Calibri" w:hAnsi="Calibri"/>
-          <w:color w:val="111111"/>
-          <w:sz w:val="20"/>
-          <w:szCs w:val="20"/>
-        </w:rPr>
-        <w:t xml:space="preserve">Deployed with clean project structure, .env secret management, and documented API reference; source on </w:t>
-      </w:r>
-      <w:hyperlink w:history="1" r:id="rIdfkhd0gj_xbd3qisgmbqha">
+        <w:t xml:space="preserve">AI-powered learning tool that maps and explains Computer Science concepts using the Claude API</w:t>
+      </w:r>
+    </w:p>
+    <w:p>
+      <w:pPr>
+        <w:pStyle w:val="ListParagraph"/>
+        <w:numPr>
+          <w:ilvl w:val="0"/>
+          <w:numId w:val="2"/>
+        </w:numPr>
+        <w:spacing w:after="20" w:before="20" w:line="276" w:lineRule="auto"/>
+      </w:pPr>
+      <w:r>
+        <w:rPr>
+          <w:rFonts w:ascii="Calibri" w:cs="Calibri" w:eastAsia="Calibri" w:hAnsi="Calibri"/>
+          <w:color w:val="111111"/>
+          <w:sz w:val="20"/>
+          <w:szCs w:val="20"/>
+        </w:rPr>
+        <w:t xml:space="preserve">Users input a topic and get structured concept breakdowns, relationships, and learning paths generated in real time</w:t>
+      </w:r>
+    </w:p>
+    <w:p>
+      <w:pPr>
+        <w:pStyle w:val="ListParagraph"/>
+        <w:numPr>
+          <w:ilvl w:val="0"/>
+          <w:numId w:val="2"/>
+        </w:numPr>
+        <w:spacing w:after="20" w:before="20" w:line="276" w:lineRule="auto"/>
+      </w:pPr>
+      <w:r>
+        <w:rPr>
+          <w:rFonts w:ascii="Calibri" w:cs="Calibri" w:eastAsia="Calibri" w:hAnsi="Calibri"/>
+          <w:color w:val="111111"/>
+          <w:sz w:val="20"/>
+          <w:szCs w:val="20"/>
+        </w:rPr>
+        <w:t xml:space="preserve">Deployed live on Streamlit Cloud — </w:t>
+      </w:r>
+      <w:hyperlink w:history="1" r:id="rIdva3gi3rrmfahfja7pcs5w">
+        <w:r>
+          <w:rPr>
+            <w:rFonts w:ascii="Calibri" w:cs="Calibri" w:eastAsia="Calibri" w:hAnsi="Calibri"/>
+            <w:color w:val="0D7377"/>
+            <w:sz w:val="18"/>
+            <w:szCs w:val="18"/>
+            <w:u w:val="single"/>
+          </w:rPr>
+          <w:t xml:space="preserve">rayan-javed-cs-concept-cartographer.streamlit.app</w:t>
+        </w:r>
+      </w:hyperlink>
+      <w:r>
+        <w:rPr>
+          <w:rFonts w:ascii="Calibri" w:cs="Calibri" w:eastAsia="Calibri" w:hAnsi="Calibri"/>
+          <w:color w:val="111111"/>
+          <w:sz w:val="20"/>
+          <w:szCs w:val="20"/>
+        </w:rPr>
+        <w:t xml:space="preserve">  ·  </w:t>
+      </w:r>
+      <w:hyperlink w:history="1" r:id="rId9smuzllp2cnmxepa9aggq">
         <w:r>
           <w:rPr>
             <w:rFonts w:ascii="Calibri" w:cs="Calibri" w:eastAsia="Calibri" w:hAnsi="Calibri"/>
@@ -567,16 +513,16 @@
           <w:sz w:val="21"/>
           <w:szCs w:val="21"/>
         </w:rPr>
-        <w:t xml:space="preserve">Coal Car Game</w:t>
-      </w:r>
-      <w:r>
-        <w:rPr>
-          <w:rFonts w:ascii="Calibri" w:cs="Calibri" w:eastAsia="Calibri" w:hAnsi="Calibri"/>
-          <w:color w:val="555555"/>
-          <w:sz w:val="20"/>
-          <w:szCs w:val="20"/>
-        </w:rPr>
-        <w:t xml:space="preserve">  —  C++ / Game Engine</w:t>
+        <w:t xml:space="preserve">BlueSpace</w:t>
+      </w:r>
+      <w:r>
+        <w:rPr>
+          <w:rFonts w:ascii="Calibri" w:cs="Calibri" w:eastAsia="Calibri" w:hAnsi="Calibri"/>
+          <w:color w:val="555555"/>
+          <w:sz w:val="20"/>
+          <w:szCs w:val="20"/>
+        </w:rPr>
+        <w:t xml:space="preserve">  —  C++, SFML, OOP, File I/O</w:t>
       </w:r>
       <w:r>
         <w:rPr>
@@ -587,28 +533,66 @@
           <w:sz w:val="19"/>
           <w:szCs w:val="19"/>
         </w:rPr>
-        <w:t xml:space="preserve">	2024</w:t>
-      </w:r>
-    </w:p>
-    <w:p>
-      <w:pPr>
-        <w:pStyle w:val="ListParagraph"/>
-        <w:numPr>
-          <w:ilvl w:val="0"/>
-          <w:numId w:val="2"/>
-        </w:numPr>
-        <w:spacing w:after="20" w:before="20" w:line="276" w:lineRule="auto"/>
-      </w:pPr>
-      <w:r>
-        <w:rPr>
-          <w:rFonts w:ascii="Calibri" w:cs="Calibri" w:eastAsia="Calibri" w:hAnsi="Calibri"/>
-          <w:color w:val="111111"/>
-          <w:sz w:val="20"/>
-          <w:szCs w:val="20"/>
-        </w:rPr>
-        <w:t xml:space="preserve">2D side-scrolling game built from scratch; source on </w:t>
-      </w:r>
-      <w:hyperlink w:history="1" r:id="rIdc6bukbf-toxm6jijozmmb">
+        <w:t xml:space="preserve">	2025</w:t>
+      </w:r>
+    </w:p>
+    <w:p>
+      <w:pPr>
+        <w:pStyle w:val="ListParagraph"/>
+        <w:numPr>
+          <w:ilvl w:val="0"/>
+          <w:numId w:val="2"/>
+        </w:numPr>
+        <w:spacing w:after="20" w:before="20" w:line="276" w:lineRule="auto"/>
+      </w:pPr>
+      <w:r>
+        <w:rPr>
+          <w:rFonts w:ascii="Calibri" w:cs="Calibri" w:eastAsia="Calibri" w:hAnsi="Calibri"/>
+          <w:color w:val="111111"/>
+          <w:sz w:val="20"/>
+          <w:szCs w:val="20"/>
+        </w:rPr>
+        <w:t xml:space="preserve">Desktop social networking application built in C++ with SFML — features user authentication, post creation, home feed, and multi-page window navigation</w:t>
+      </w:r>
+    </w:p>
+    <w:p>
+      <w:pPr>
+        <w:pStyle w:val="ListParagraph"/>
+        <w:numPr>
+          <w:ilvl w:val="0"/>
+          <w:numId w:val="2"/>
+        </w:numPr>
+        <w:spacing w:after="20" w:before="20" w:line="276" w:lineRule="auto"/>
+      </w:pPr>
+      <w:r>
+        <w:rPr>
+          <w:rFonts w:ascii="Calibri" w:cs="Calibri" w:eastAsia="Calibri" w:hAnsi="Calibri"/>
+          <w:color w:val="111111"/>
+          <w:sz w:val="20"/>
+          <w:szCs w:val="20"/>
+        </w:rPr>
+        <w:t xml:space="preserve">Implemented custom graphics, audio, and UI components from scratch with no UI framework</w:t>
+      </w:r>
+    </w:p>
+    <w:p>
+      <w:pPr>
+        <w:pStyle w:val="ListParagraph"/>
+        <w:numPr>
+          <w:ilvl w:val="0"/>
+          <w:numId w:val="2"/>
+        </w:numPr>
+        <w:spacing w:after="20" w:before="20" w:line="276" w:lineRule="auto"/>
+      </w:pPr>
+      <w:r>
+        <w:rPr>
+          <w:rFonts w:ascii="Calibri" w:cs="Calibri" w:eastAsia="Calibri" w:hAnsi="Calibri"/>
+          <w:color w:val="111111"/>
+          <w:sz w:val="20"/>
+          <w:szCs w:val="20"/>
+        </w:rPr>
+        <w:t xml:space="preserve">Demonstrates strong OOP design and low-level systems programming; source on </w:t>
+      </w:r>
+      <w:hyperlink w:history="1" r:id="rIduceiayfr8o3fox3bx1qot">
         <w:r>
           <w:rPr>
             <w:rFonts w:ascii="Calibri" w:cs="Calibri" w:eastAsia="Calibri" w:hAnsi="Calibri"/>
@@ -623,25 +607,6 @@
     </w:p>
     <w:p>
       <w:pPr>
-        <w:pStyle w:val="ListParagraph"/>
-        <w:numPr>
-          <w:ilvl w:val="0"/>
-          <w:numId w:val="2"/>
-        </w:numPr>
-        <w:spacing w:after="20" w:before="20" w:line="276" w:lineRule="auto"/>
-      </w:pPr>
-      <w:r>
-        <w:rPr>
-          <w:rFonts w:ascii="Calibri" w:cs="Calibri" w:eastAsia="Calibri" w:hAnsi="Calibri"/>
-          <w:color w:val="111111"/>
-          <w:sz w:val="20"/>
-          <w:szCs w:val="20"/>
-        </w:rPr>
-        <w:t xml:space="preserve">Implemented physics, collision detection, scoring, and game-loop management</w:t>
-      </w:r>
-    </w:p>
-    <w:p>
-      <w:pPr>
         <w:tabs>
           <w:tab w:val="right" w:pos="9000"/>
         </w:tabs>
@@ -656,16 +621,16 @@
           <w:sz w:val="21"/>
           <w:szCs w:val="21"/>
         </w:rPr>
-        <w:t xml:space="preserve">Salon Website</w:t>
-      </w:r>
-      <w:r>
-        <w:rPr>
-          <w:rFonts w:ascii="Calibri" w:cs="Calibri" w:eastAsia="Calibri" w:hAnsi="Calibri"/>
-          <w:color w:val="555555"/>
-          <w:sz w:val="20"/>
-          <w:szCs w:val="20"/>
-        </w:rPr>
-        <w:t xml:space="preserve">  —  HTML, CSS, JavaScript — deployed on Vercel</w:t>
+        <w:t xml:space="preserve">Django Inventory App + REST API</w:t>
+      </w:r>
+      <w:r>
+        <w:rPr>
+          <w:rFonts w:ascii="Calibri" w:cs="Calibri" w:eastAsia="Calibri" w:hAnsi="Calibri"/>
+          <w:color w:val="555555"/>
+          <w:sz w:val="20"/>
+          <w:szCs w:val="20"/>
+        </w:rPr>
+        <w:t xml:space="preserve">  —  Python, Django, Django REST Framework, SQLite</w:t>
       </w:r>
       <w:r>
         <w:rPr>
@@ -676,6 +641,114 @@
           <w:sz w:val="19"/>
           <w:szCs w:val="19"/>
         </w:rPr>
+        <w:t xml:space="preserve">	2025</w:t>
+      </w:r>
+    </w:p>
+    <w:p>
+      <w:pPr>
+        <w:pStyle w:val="ListParagraph"/>
+        <w:numPr>
+          <w:ilvl w:val="0"/>
+          <w:numId w:val="2"/>
+        </w:numPr>
+        <w:spacing w:after="20" w:before="20" w:line="276" w:lineRule="auto"/>
+      </w:pPr>
+      <w:r>
+        <w:rPr>
+          <w:rFonts w:ascii="Calibri" w:cs="Calibri" w:eastAsia="Calibri" w:hAnsi="Calibri"/>
+          <w:color w:val="111111"/>
+          <w:sz w:val="20"/>
+          <w:szCs w:val="20"/>
+        </w:rPr>
+        <w:t xml:space="preserve">Built a full-stack inventory management web app with session-based auth, protected routes, and full CRUD via Django templates</w:t>
+      </w:r>
+    </w:p>
+    <w:p>
+      <w:pPr>
+        <w:pStyle w:val="ListParagraph"/>
+        <w:numPr>
+          <w:ilvl w:val="0"/>
+          <w:numId w:val="2"/>
+        </w:numPr>
+        <w:spacing w:after="20" w:before="20" w:line="276" w:lineRule="auto"/>
+      </w:pPr>
+      <w:r>
+        <w:rPr>
+          <w:rFonts w:ascii="Calibri" w:cs="Calibri" w:eastAsia="Calibri" w:hAnsi="Calibri"/>
+          <w:color w:val="111111"/>
+          <w:sz w:val="20"/>
+          <w:szCs w:val="20"/>
+        </w:rPr>
+        <w:t xml:space="preserve">Extended with a DRF REST API layer — ModelViewSet, ProductSerializer, and Token Authentication; all endpoints tested via curl</w:t>
+      </w:r>
+    </w:p>
+    <w:p>
+      <w:pPr>
+        <w:pStyle w:val="ListParagraph"/>
+        <w:numPr>
+          <w:ilvl w:val="0"/>
+          <w:numId w:val="2"/>
+        </w:numPr>
+        <w:spacing w:after="20" w:before="20" w:line="276" w:lineRule="auto"/>
+      </w:pPr>
+      <w:r>
+        <w:rPr>
+          <w:rFonts w:ascii="Calibri" w:cs="Calibri" w:eastAsia="Calibri" w:hAnsi="Calibri"/>
+          <w:color w:val="111111"/>
+          <w:sz w:val="20"/>
+          <w:szCs w:val="20"/>
+        </w:rPr>
+        <w:t xml:space="preserve">Deployed with clean project structure, .env secret management, and documented API reference; source on </w:t>
+      </w:r>
+      <w:hyperlink w:history="1" r:id="rIdo9byrtcuburvaotsriqpg">
+        <w:r>
+          <w:rPr>
+            <w:rFonts w:ascii="Calibri" w:cs="Calibri" w:eastAsia="Calibri" w:hAnsi="Calibri"/>
+            <w:color w:val="0D7377"/>
+            <w:sz w:val="18"/>
+            <w:szCs w:val="18"/>
+            <w:u w:val="single"/>
+          </w:rPr>
+          <w:t xml:space="preserve">GitHub</w:t>
+        </w:r>
+      </w:hyperlink>
+    </w:p>
+    <w:p>
+      <w:pPr>
+        <w:tabs>
+          <w:tab w:val="right" w:pos="9000"/>
+        </w:tabs>
+        <w:spacing w:after="20" w:before="120" w:line="276" w:lineRule="auto"/>
+      </w:pPr>
+      <w:r>
+        <w:rPr>
+          <w:rFonts w:ascii="Calibri" w:cs="Calibri" w:eastAsia="Calibri" w:hAnsi="Calibri"/>
+          <w:b/>
+          <w:bCs/>
+          <w:color w:val="1B2A4A"/>
+          <w:sz w:val="21"/>
+          <w:szCs w:val="21"/>
+        </w:rPr>
+        <w:t xml:space="preserve">Coal Car Game</w:t>
+      </w:r>
+      <w:r>
+        <w:rPr>
+          <w:rFonts w:ascii="Calibri" w:cs="Calibri" w:eastAsia="Calibri" w:hAnsi="Calibri"/>
+          <w:color w:val="555555"/>
+          <w:sz w:val="20"/>
+          <w:szCs w:val="20"/>
+        </w:rPr>
+        <w:t xml:space="preserve">  —  C++ / Game Engine</w:t>
+      </w:r>
+      <w:r>
+        <w:rPr>
+          <w:rFonts w:ascii="Calibri" w:cs="Calibri" w:eastAsia="Calibri" w:hAnsi="Calibri"/>
+          <w:i/>
+          <w:iCs/>
+          <w:color w:val="555555"/>
+          <w:sz w:val="19"/>
+          <w:szCs w:val="19"/>
+        </w:rPr>
         <w:t xml:space="preserve">	2024</w:t>
       </w:r>
     </w:p>
@@ -695,9 +768,98 @@
           <w:sz w:val="20"/>
           <w:szCs w:val="20"/>
         </w:rPr>
+        <w:t xml:space="preserve">2D side-scrolling game built from scratch; source on </w:t>
+      </w:r>
+      <w:hyperlink w:history="1" r:id="rIdlkkvyithp3f7wboi0hues">
+        <w:r>
+          <w:rPr>
+            <w:rFonts w:ascii="Calibri" w:cs="Calibri" w:eastAsia="Calibri" w:hAnsi="Calibri"/>
+            <w:color w:val="0D7377"/>
+            <w:sz w:val="18"/>
+            <w:szCs w:val="18"/>
+            <w:u w:val="single"/>
+          </w:rPr>
+          <w:t xml:space="preserve">GitHub</w:t>
+        </w:r>
+      </w:hyperlink>
+    </w:p>
+    <w:p>
+      <w:pPr>
+        <w:pStyle w:val="ListParagraph"/>
+        <w:numPr>
+          <w:ilvl w:val="0"/>
+          <w:numId w:val="2"/>
+        </w:numPr>
+        <w:spacing w:after="20" w:before="20" w:line="276" w:lineRule="auto"/>
+      </w:pPr>
+      <w:r>
+        <w:rPr>
+          <w:rFonts w:ascii="Calibri" w:cs="Calibri" w:eastAsia="Calibri" w:hAnsi="Calibri"/>
+          <w:color w:val="111111"/>
+          <w:sz w:val="20"/>
+          <w:szCs w:val="20"/>
+        </w:rPr>
+        <w:t xml:space="preserve">Implemented physics, collision detection, scoring, and game-loop management</w:t>
+      </w:r>
+    </w:p>
+    <w:p>
+      <w:pPr>
+        <w:tabs>
+          <w:tab w:val="right" w:pos="9000"/>
+        </w:tabs>
+        <w:spacing w:after="20" w:before="120" w:line="276" w:lineRule="auto"/>
+      </w:pPr>
+      <w:r>
+        <w:rPr>
+          <w:rFonts w:ascii="Calibri" w:cs="Calibri" w:eastAsia="Calibri" w:hAnsi="Calibri"/>
+          <w:b/>
+          <w:bCs/>
+          <w:color w:val="1B2A4A"/>
+          <w:sz w:val="21"/>
+          <w:szCs w:val="21"/>
+        </w:rPr>
+        <w:t xml:space="preserve">Salon Website</w:t>
+      </w:r>
+      <w:r>
+        <w:rPr>
+          <w:rFonts w:ascii="Calibri" w:cs="Calibri" w:eastAsia="Calibri" w:hAnsi="Calibri"/>
+          <w:color w:val="555555"/>
+          <w:sz w:val="20"/>
+          <w:szCs w:val="20"/>
+        </w:rPr>
+        <w:t xml:space="preserve">  —  HTML, CSS, JavaScript — deployed on Vercel</w:t>
+      </w:r>
+      <w:r>
+        <w:rPr>
+          <w:rFonts w:ascii="Calibri" w:cs="Calibri" w:eastAsia="Calibri" w:hAnsi="Calibri"/>
+          <w:i/>
+          <w:iCs/>
+          <w:color w:val="555555"/>
+          <w:sz w:val="19"/>
+          <w:szCs w:val="19"/>
+        </w:rPr>
+        <w:t xml:space="preserve">	2024</w:t>
+      </w:r>
+    </w:p>
+    <w:p>
+      <w:pPr>
+        <w:pStyle w:val="ListParagraph"/>
+        <w:numPr>
+          <w:ilvl w:val="0"/>
+          <w:numId w:val="2"/>
+        </w:numPr>
+        <w:spacing w:after="20" w:before="20" w:line="276" w:lineRule="auto"/>
+      </w:pPr>
+      <w:r>
+        <w:rPr>
+          <w:rFonts w:ascii="Calibri" w:cs="Calibri" w:eastAsia="Calibri" w:hAnsi="Calibri"/>
+          <w:color w:val="111111"/>
+          <w:sz w:val="20"/>
+          <w:szCs w:val="20"/>
+        </w:rPr>
         <w:t xml:space="preserve">Responsive multi-page business website; live at </w:t>
       </w:r>
-      <w:hyperlink w:history="1" r:id="rId6bt9oh_oubvpf-t3if6sw">
+      <w:hyperlink w:history="1" r:id="rId0jlpeikvqszdt2o8v-wjj">
         <w:r>
           <w:rPr>
             <w:rFonts w:ascii="Calibri" w:cs="Calibri" w:eastAsia="Calibri" w:hAnsi="Calibri"/>
@@ -718,7 +880,7 @@
         </w:rPr>
         <w:t xml:space="preserve"> · </w:t>
       </w:r>
-      <w:hyperlink w:history="1" r:id="rId5ub78zbatxyhcqaw8gggs">
+      <w:hyperlink w:history="1" r:id="rIdxutap6aegj3v7hr9twaha">
         <w:r>
           <w:rPr>
             <w:rFonts w:ascii="Calibri" w:cs="Calibri" w:eastAsia="Calibri" w:hAnsi="Calibri"/>
@@ -1098,7 +1260,7 @@
                 <w:sz w:val="19"/>
                 <w:szCs w:val="19"/>
               </w:rPr>
-              <w:t xml:space="preserve">Python, C++, JavaScript, HTML/CSS, SQL</w:t>
+              <w:t xml:space="preserve">Python, C++, JavaScript, TypeScript, HTML/CSS, SQL, x86 Assembly</w:t>
             </w:r>
           </w:p>
         </w:tc>
@@ -1162,7 +1324,71 @@
                 <w:sz w:val="19"/>
                 <w:szCs w:val="19"/>
               </w:rPr>
-              <w:t xml:space="preserve">Django, Django REST Framework, LangChain, React (basics)</w:t>
+              <w:t xml:space="preserve">Django, Django REST Framework, Next.js, React, SFML, Streamlit</w:t>
+            </w:r>
+          </w:p>
+        </w:tc>
+      </w:tr>
+      <w:tr>
+        <w:tc>
+          <w:tcPr>
+            <w:tcW w:type="dxa" w:w="2000"/>
+            <w:tcBorders>
+              <w:top w:val="none" w:color="FFFFFF" w:sz="0"/>
+              <w:left w:val="none" w:color="FFFFFF" w:sz="0"/>
+              <w:bottom w:val="none" w:color="FFFFFF" w:sz="0"/>
+              <w:right w:val="none" w:color="FFFFFF" w:sz="0"/>
+            </w:tcBorders>
+            <w:shd w:fill="F2F4F7" w:val="clear"/>
+            <w:tcMar>
+              <w:top w:type="dxa" w:w="60"/>
+              <w:left w:type="dxa" w:w="80"/>
+              <w:bottom w:type="dxa" w:w="60"/>
+              <w:right w:type="dxa" w:w="80"/>
+            </w:tcMar>
+            <w:vAlign w:val="center"/>
+          </w:tcPr>
+          <w:p>
+            <w:r>
+              <w:rPr>
+                <w:rFonts w:ascii="Calibri" w:cs="Calibri" w:eastAsia="Calibri" w:hAnsi="Calibri"/>
+                <w:b/>
+                <w:bCs/>
+                <w:color w:val="1B2A4A"/>
+                <w:sz w:val="19"/>
+                <w:szCs w:val="19"/>
+              </w:rPr>
+              <w:t xml:space="preserve">AI / ML</w:t>
+            </w:r>
+          </w:p>
+        </w:tc>
+        <w:tc>
+          <w:tcPr>
+            <w:tcW w:type="dxa" w:w="7360"/>
+            <w:tcBorders>
+              <w:top w:val="none" w:color="FFFFFF" w:sz="0"/>
+              <w:left w:val="none" w:color="FFFFFF" w:sz="0"/>
+              <w:bottom w:val="none" w:color="FFFFFF" w:sz="0"/>
+              <w:right w:val="none" w:color="FFFFFF" w:sz="0"/>
+            </w:tcBorders>
+            <w:shd w:fill="FFFFFF" w:val="clear"/>
+            <w:tcMar>
+              <w:top w:type="dxa" w:w="60"/>
+              <w:left w:type="dxa" w:w="80"/>
+              <w:bottom w:type="dxa" w:w="60"/>
+              <w:right w:type="dxa" w:w="80"/>
+            </w:tcMar>
+            <w:vAlign w:val="center"/>
+          </w:tcPr>
+          <w:p>
+            <w:r>
+              <w:rPr>
+                <w:rFonts w:ascii="Calibri" w:cs="Calibri" w:eastAsia="Calibri" w:hAnsi="Calibri"/>
+                <w:color w:val="111111"/>
+                <w:sz w:val="19"/>
+                <w:szCs w:val="19"/>
+              </w:rPr>
+              <w:t xml:space="preserve">Claude API, LangChain, RAG pipelines, Prompt Engineering</w:t>
             </w:r>
           </w:p>
         </w:tc>
@@ -1290,7 +1516,7 @@
                 <w:sz w:val="19"/>
                 <w:szCs w:val="19"/>
               </w:rPr>
-              <w:t xml:space="preserve">REST APIs, RAG pipelines, OOP, Data Structures &amp; Algorithms</w:t>
+              <w:t xml:space="preserve">REST APIs, OOP, Data Structures &amp; Algorithms, File I/O, Game Loops</w:t>
             </w:r>
           </w:p>
         </w:tc>

</xml_diff>